<commit_message>
Use MCA Solutions AB as the legal party in contracts and legal pages
- Offers, agreements, PUB agreements and xlsx export now take the supplier
  name, org.nr, address, email and phone from company_settings instead of
  hardcoded "Triad Solutions" / placeholders
- Documents fall back to the company name as text until a new
  public/logos/document-logo.png is added (the Triad logo is no longer used)
- Website privacy policy and terms: MCA Solutions AB (559601-0016),
  "trading as Triad Solutions" removed, contact kontakt@mcasolutions.se
- Who's In EULA/privacy and StackHive privacy policy: MCA Solutions AB
- PUB webbplats template source and docx regenerated

Co-Authored-By: Claude Opus 5.5 <noreply@anthropic.com>
Claude-Session: https://claude.ai/code/session_01FZWWAB2kfT6yGCG8vzZDmJ
</commit_message>
<xml_diff>
--- a/admin/docs/pub-mallar/PUB-Avtal-webbplats.docx
+++ b/admin/docs/pub-mallar/PUB-Avtal-webbplats.docx
@@ -40,7 +40,7 @@
         <w:t xml:space="preserve">Personuppgiftsbiträde (PUB): </w:t>
       </w:r>
       <w:r>
-        <w:t xml:space="preserve">Triad Solutions AB, org.nr </w:t>
+        <w:t xml:space="preserve">MCA Solutions AB, org.nr </w:t>
       </w:r>
       <w:r>
         <w:rPr>
@@ -1752,7 +1752,7 @@
         <w:t xml:space="preserve">E-post: </w:t>
       </w:r>
       <w:r>
-        <w:t xml:space="preserve">kontakt@triadsolutions.se</w:t>
+        <w:t xml:space="preserve">kontakt@mcasolutions.se</w:t>
       </w:r>
     </w:p>
     <w:p>

</xml_diff>